<commit_message>
added icon to author, done some responsive design.
</commit_message>
<xml_diff>
--- a/Headlines.docx
+++ b/Headlines.docx
@@ -1,6 +1,6 @@
 
 <file path=word/document.xml><?xml version="1.0" encoding="utf-8"?>
-<w:document xmlns:wpc="http://schemas.microsoft.com/office/word/2010/wordprocessingCanvas" xmlns:cx="http://schemas.microsoft.com/office/drawing/2014/chartex" xmlns:cx1="http://schemas.microsoft.com/office/drawing/2015/9/8/chartex" xmlns:cx2="http://schemas.microsoft.com/office/drawing/2015/10/21/chartex" xmlns:cx3="http://schemas.microsoft.com/office/drawing/2016/5/9/chartex" xmlns:cx4="http://schemas.microsoft.com/office/drawing/2016/5/10/chartex" xmlns:cx5="http://schemas.microsoft.com/office/drawing/2016/5/11/chartex" xmlns:cx6="http://schemas.microsoft.com/office/drawing/2016/5/12/chartex" xmlns:cx7="http://schemas.microsoft.com/office/drawing/2016/5/13/chartex" xmlns:cx8="http://schemas.microsoft.com/office/drawing/2016/5/14/chartex" xmlns:mc="http://schemas.openxmlformats.org/markup-compatibility/2006" xmlns:aink="http://schemas.microsoft.com/office/drawing/2016/ink" xmlns:am3d="http://schemas.microsoft.com/office/drawing/2017/model3d" xmlns:o="urn:schemas-microsoft-com:office:office" xmlns:oel="http://schemas.microsoft.com/office/2019/extlst" xmlns:r="http://schemas.openxmlformats.org/officeDocument/2006/relationships" xmlns:m="http://schemas.openxmlformats.org/officeDocument/2006/math" xmlns:v="urn:schemas-microsoft-com:vml" xmlns:wp14="http://schemas.microsoft.com/office/word/2010/wordprocessingDrawing" xmlns:wp="http://schemas.openxmlformats.org/drawingml/2006/wordprocessingDrawing" xmlns:w10="urn:schemas-microsoft-com:office:word" xmlns:w="http://schemas.openxmlformats.org/wordprocessingml/2006/main" xmlns:w14="http://schemas.microsoft.com/office/word/2010/wordml" xmlns:w15="http://schemas.microsoft.com/office/word/2012/wordml" xmlns:w16cex="http://schemas.microsoft.com/office/word/2018/wordml/cex" xmlns:w16cid="http://schemas.microsoft.com/office/word/2016/wordml/cid" xmlns:w16="http://schemas.microsoft.com/office/word/2018/wordml" xmlns:w16sdtdh="http://schemas.microsoft.com/office/word/2020/wordml/sdtdatahash" xmlns:w16se="http://schemas.microsoft.com/office/word/2015/wordml/symex" xmlns:wpg="http://schemas.microsoft.com/office/word/2010/wordprocessingGroup" xmlns:wpi="http://schemas.microsoft.com/office/word/2010/wordprocessingInk" xmlns:wne="http://schemas.microsoft.com/office/word/2006/wordml" xmlns:wps="http://schemas.microsoft.com/office/word/2010/wordprocessingShape" mc:Ignorable="w14 w15 w16se w16cid w16 w16cex w16sdtdh wp14">
+<w:document xmlns:wpc="http://schemas.microsoft.com/office/word/2010/wordprocessingCanvas" xmlns:cx="http://schemas.microsoft.com/office/drawing/2014/chartex" xmlns:cx1="http://schemas.microsoft.com/office/drawing/2015/9/8/chartex" xmlns:cx2="http://schemas.microsoft.com/office/drawing/2015/10/21/chartex" xmlns:cx3="http://schemas.microsoft.com/office/drawing/2016/5/9/chartex" xmlns:cx4="http://schemas.microsoft.com/office/drawing/2016/5/10/chartex" xmlns:cx5="http://schemas.microsoft.com/office/drawing/2016/5/11/chartex" xmlns:cx6="http://schemas.microsoft.com/office/drawing/2016/5/12/chartex" xmlns:cx7="http://schemas.microsoft.com/office/drawing/2016/5/13/chartex" xmlns:cx8="http://schemas.microsoft.com/office/drawing/2016/5/14/chartex" xmlns:mc="http://schemas.openxmlformats.org/markup-compatibility/2006" xmlns:aink="http://schemas.microsoft.com/office/drawing/2016/ink" xmlns:am3d="http://schemas.microsoft.com/office/drawing/2017/model3d" xmlns:o="urn:schemas-microsoft-com:office:office" xmlns:oel="http://schemas.microsoft.com/office/2019/extlst" xmlns:r="http://schemas.openxmlformats.org/officeDocument/2006/relationships" xmlns:m="http://schemas.openxmlformats.org/officeDocument/2006/math" xmlns:v="urn:schemas-microsoft-com:vml" xmlns:wp14="http://schemas.microsoft.com/office/word/2010/wordprocessingDrawing" xmlns:wp="http://schemas.openxmlformats.org/drawingml/2006/wordprocessingDrawing" xmlns:w10="urn:schemas-microsoft-com:office:word" xmlns:w="http://schemas.openxmlformats.org/wordprocessingml/2006/main" xmlns:w14="http://schemas.microsoft.com/office/word/2010/wordml" xmlns:w15="http://schemas.microsoft.com/office/word/2012/wordml" xmlns:w16cex="http://schemas.microsoft.com/office/word/2018/wordml/cex" xmlns:w16cid="http://schemas.microsoft.com/office/word/2016/wordml/cid" xmlns:w16="http://schemas.microsoft.com/office/word/2018/wordml" xmlns:w16du="http://schemas.microsoft.com/office/word/2023/wordml/word16du" xmlns:w16sdtdh="http://schemas.microsoft.com/office/word/2020/wordml/sdtdatahash" xmlns:w16se="http://schemas.microsoft.com/office/word/2015/wordml/symex" xmlns:wpg="http://schemas.microsoft.com/office/word/2010/wordprocessingGroup" xmlns:wpi="http://schemas.microsoft.com/office/word/2010/wordprocessingInk" xmlns:wne="http://schemas.microsoft.com/office/word/2006/wordml" xmlns:wps="http://schemas.microsoft.com/office/word/2010/wordprocessingShape" mc:Ignorable="w14 w15 w16se w16cid w16 w16cex w16sdtdh w16du wp14">
   <w:body>
     <w:p>
       <w:pPr>
@@ -77,7 +77,83 @@
           <w:szCs w:val="28"/>
           <w:lang w:val="en-US"/>
         </w:rPr>
-        <w:t>Tam Electric’s master of mischief, Danny Russo, was recently spotted concocting his next major prank on a job site in Cobourg. Rumor has it that this caper may outshine all previous antics, potentially featuring Bombay chicken and chopsticks from Blue Sky,</w:t>
+        <w:t>Tam Electric’s master of mischief, Danny Russo, was recently spotted concocting his next major prank on a job site in Cobourg. Rumor has it that this caper may outshine all previous antics, potentially featuring Bombay chicken and chopsticks from Blue Sky</w:t>
+      </w:r>
+      <w:r>
+        <w:rPr>
+          <w:rFonts w:ascii="Times New Roman" w:hAnsi="Times New Roman" w:cs="Times New Roman"/>
+          <w:sz w:val="28"/>
+          <w:szCs w:val="28"/>
+          <w:lang w:val="en-US"/>
+        </w:rPr>
+        <w:t xml:space="preserve">. </w:t>
+      </w:r>
+    </w:p>
+    <w:p>
+      <w:pPr>
+        <w:rPr>
+          <w:rFonts w:ascii="Times New Roman" w:hAnsi="Times New Roman" w:cs="Times New Roman"/>
+          <w:sz w:val="28"/>
+          <w:szCs w:val="28"/>
+          <w:lang w:val="en-US"/>
+        </w:rPr>
+      </w:pPr>
+      <w:r>
+        <w:rPr>
+          <w:rFonts w:ascii="Times New Roman" w:hAnsi="Times New Roman" w:cs="Times New Roman"/>
+          <w:noProof/>
+          <w:sz w:val="28"/>
+          <w:szCs w:val="28"/>
+          <w:lang w:val="en-US"/>
+        </w:rPr>
+        <w:drawing>
+          <wp:inline distT="0" distB="0" distL="0" distR="0" wp14:anchorId="3AB69014" wp14:editId="10106833">
+            <wp:extent cx="1414463" cy="2600205"/>
+            <wp:effectExtent l="0" t="0" r="0" b="0"/>
+            <wp:docPr id="1482590384" name="Picture 1"/>
+            <wp:cNvGraphicFramePr>
+              <a:graphicFrameLocks xmlns:a="http://schemas.openxmlformats.org/drawingml/2006/main" noChangeAspect="1"/>
+            </wp:cNvGraphicFramePr>
+            <a:graphic xmlns:a="http://schemas.openxmlformats.org/drawingml/2006/main">
+              <a:graphicData uri="http://schemas.openxmlformats.org/drawingml/2006/picture">
+                <pic:pic xmlns:pic="http://schemas.openxmlformats.org/drawingml/2006/picture">
+                  <pic:nvPicPr>
+                    <pic:cNvPr id="0" name="Picture 1"/>
+                    <pic:cNvPicPr>
+                      <a:picLocks noChangeAspect="1" noChangeArrowheads="1"/>
+                    </pic:cNvPicPr>
+                  </pic:nvPicPr>
+                  <pic:blipFill>
+                    <a:blip r:embed="rId4" cstate="print">
+                      <a:extLst>
+                        <a:ext uri="{28A0092B-C50C-407E-A947-70E740481C1C}">
+                          <a14:useLocalDpi xmlns:a14="http://schemas.microsoft.com/office/drawing/2010/main" val="0"/>
+                        </a:ext>
+                      </a:extLst>
+                    </a:blip>
+                    <a:srcRect/>
+                    <a:stretch>
+                      <a:fillRect/>
+                    </a:stretch>
+                  </pic:blipFill>
+                  <pic:spPr bwMode="auto">
+                    <a:xfrm>
+                      <a:off x="0" y="0"/>
+                      <a:ext cx="1422519" cy="2615014"/>
+                    </a:xfrm>
+                    <a:prstGeom prst="rect">
+                      <a:avLst/>
+                    </a:prstGeom>
+                    <a:noFill/>
+                    <a:ln>
+                      <a:noFill/>
+                    </a:ln>
+                  </pic:spPr>
+                </pic:pic>
+              </a:graphicData>
+            </a:graphic>
+          </wp:inline>
+        </w:drawing>
       </w:r>
     </w:p>
     <w:p>
@@ -141,6 +217,74 @@
           <w:lang w:val="en-US"/>
         </w:rPr>
       </w:pPr>
+      <w:r>
+        <w:rPr>
+          <w:rFonts w:ascii="Times New Roman" w:hAnsi="Times New Roman" w:cs="Times New Roman"/>
+          <w:noProof/>
+          <w:sz w:val="28"/>
+          <w:szCs w:val="28"/>
+          <w:lang w:val="en-US"/>
+        </w:rPr>
+        <w:lastRenderedPageBreak/>
+        <w:drawing>
+          <wp:inline distT="0" distB="0" distL="0" distR="0" wp14:anchorId="0810A83A" wp14:editId="4638E75B">
+            <wp:extent cx="2524125" cy="4643845"/>
+            <wp:effectExtent l="0" t="0" r="0" b="4445"/>
+            <wp:docPr id="57392104" name="Picture 2"/>
+            <wp:cNvGraphicFramePr>
+              <a:graphicFrameLocks xmlns:a="http://schemas.openxmlformats.org/drawingml/2006/main" noChangeAspect="1"/>
+            </wp:cNvGraphicFramePr>
+            <a:graphic xmlns:a="http://schemas.openxmlformats.org/drawingml/2006/main">
+              <a:graphicData uri="http://schemas.openxmlformats.org/drawingml/2006/picture">
+                <pic:pic xmlns:pic="http://schemas.openxmlformats.org/drawingml/2006/picture">
+                  <pic:nvPicPr>
+                    <pic:cNvPr id="0" name="Picture 2"/>
+                    <pic:cNvPicPr>
+                      <a:picLocks noChangeAspect="1" noChangeArrowheads="1"/>
+                    </pic:cNvPicPr>
+                  </pic:nvPicPr>
+                  <pic:blipFill>
+                    <a:blip r:embed="rId5" cstate="print">
+                      <a:extLst>
+                        <a:ext uri="{28A0092B-C50C-407E-A947-70E740481C1C}">
+                          <a14:useLocalDpi xmlns:a14="http://schemas.microsoft.com/office/drawing/2010/main" val="0"/>
+                        </a:ext>
+                      </a:extLst>
+                    </a:blip>
+                    <a:srcRect/>
+                    <a:stretch>
+                      <a:fillRect/>
+                    </a:stretch>
+                  </pic:blipFill>
+                  <pic:spPr bwMode="auto">
+                    <a:xfrm>
+                      <a:off x="0" y="0"/>
+                      <a:ext cx="2534692" cy="4663286"/>
+                    </a:xfrm>
+                    <a:prstGeom prst="rect">
+                      <a:avLst/>
+                    </a:prstGeom>
+                    <a:noFill/>
+                    <a:ln>
+                      <a:noFill/>
+                    </a:ln>
+                  </pic:spPr>
+                </pic:pic>
+              </a:graphicData>
+            </a:graphic>
+          </wp:inline>
+        </w:drawing>
+      </w:r>
+    </w:p>
+    <w:p>
+      <w:pPr>
+        <w:rPr>
+          <w:rFonts w:ascii="Times New Roman" w:hAnsi="Times New Roman" w:cs="Times New Roman"/>
+          <w:sz w:val="28"/>
+          <w:szCs w:val="28"/>
+          <w:lang w:val="en-US"/>
+        </w:rPr>
+      </w:pPr>
     </w:p>
     <w:p>
       <w:pPr>
@@ -188,6 +332,74 @@
       <w:pPr>
         <w:rPr>
           <w:rFonts w:ascii="Times New Roman" w:hAnsi="Times New Roman" w:cs="Times New Roman"/>
+          <w:sz w:val="28"/>
+          <w:szCs w:val="28"/>
+          <w:lang w:val="en-US"/>
+        </w:rPr>
+      </w:pPr>
+      <w:r>
+        <w:rPr>
+          <w:rFonts w:ascii="Times New Roman" w:hAnsi="Times New Roman" w:cs="Times New Roman"/>
+          <w:noProof/>
+          <w:sz w:val="28"/>
+          <w:szCs w:val="28"/>
+          <w:lang w:val="en-US"/>
+        </w:rPr>
+        <w:lastRenderedPageBreak/>
+        <w:drawing>
+          <wp:inline distT="0" distB="0" distL="0" distR="0" wp14:anchorId="4D909104" wp14:editId="0B5B3CD1">
+            <wp:extent cx="1803135" cy="3314700"/>
+            <wp:effectExtent l="0" t="0" r="6985" b="0"/>
+            <wp:docPr id="668571150" name="Picture 3"/>
+            <wp:cNvGraphicFramePr>
+              <a:graphicFrameLocks xmlns:a="http://schemas.openxmlformats.org/drawingml/2006/main" noChangeAspect="1"/>
+            </wp:cNvGraphicFramePr>
+            <a:graphic xmlns:a="http://schemas.openxmlformats.org/drawingml/2006/main">
+              <a:graphicData uri="http://schemas.openxmlformats.org/drawingml/2006/picture">
+                <pic:pic xmlns:pic="http://schemas.openxmlformats.org/drawingml/2006/picture">
+                  <pic:nvPicPr>
+                    <pic:cNvPr id="0" name="Picture 3"/>
+                    <pic:cNvPicPr>
+                      <a:picLocks noChangeAspect="1" noChangeArrowheads="1"/>
+                    </pic:cNvPicPr>
+                  </pic:nvPicPr>
+                  <pic:blipFill>
+                    <a:blip r:embed="rId6" cstate="print">
+                      <a:extLst>
+                        <a:ext uri="{28A0092B-C50C-407E-A947-70E740481C1C}">
+                          <a14:useLocalDpi xmlns:a14="http://schemas.microsoft.com/office/drawing/2010/main" val="0"/>
+                        </a:ext>
+                      </a:extLst>
+                    </a:blip>
+                    <a:srcRect/>
+                    <a:stretch>
+                      <a:fillRect/>
+                    </a:stretch>
+                  </pic:blipFill>
+                  <pic:spPr bwMode="auto">
+                    <a:xfrm>
+                      <a:off x="0" y="0"/>
+                      <a:ext cx="1806426" cy="3320749"/>
+                    </a:xfrm>
+                    <a:prstGeom prst="rect">
+                      <a:avLst/>
+                    </a:prstGeom>
+                    <a:noFill/>
+                    <a:ln>
+                      <a:noFill/>
+                    </a:ln>
+                  </pic:spPr>
+                </pic:pic>
+              </a:graphicData>
+            </a:graphic>
+          </wp:inline>
+        </w:drawing>
+      </w:r>
+    </w:p>
+    <w:p>
+      <w:pPr>
+        <w:rPr>
+          <w:rFonts w:ascii="Times New Roman" w:hAnsi="Times New Roman" w:cs="Times New Roman"/>
           <w:b/>
           <w:bCs/>
           <w:sz w:val="36"/>
@@ -232,19 +444,8 @@
           <w:szCs w:val="28"/>
           <w:lang w:val="en-US"/>
         </w:rPr>
-        <w:t xml:space="preserve">successfully weds a witch who remains blissfully unaware of his </w:t>
-      </w:r>
-      <w:proofErr w:type="gramStart"/>
-      <w:r>
-        <w:rPr>
-          <w:rFonts w:ascii="Times New Roman" w:hAnsi="Times New Roman" w:cs="Times New Roman"/>
-          <w:sz w:val="28"/>
-          <w:szCs w:val="28"/>
-          <w:lang w:val="en-US"/>
-        </w:rPr>
-        <w:t>true identity</w:t>
-      </w:r>
-      <w:proofErr w:type="gramEnd"/>
+        <w:t>successfully weds a witch who remains blissfully unaware of his true identity</w:t>
+      </w:r>
       <w:r>
         <w:rPr>
           <w:rFonts w:ascii="Times New Roman" w:hAnsi="Times New Roman" w:cs="Times New Roman"/>
@@ -342,84 +543,84 @@
           <w:szCs w:val="28"/>
           <w:lang w:val="en-US"/>
         </w:rPr>
-        <w:t xml:space="preserve">. He had abandoned her and her mother for his </w:t>
-      </w:r>
-      <w:r>
-        <w:rPr>
-          <w:rFonts w:ascii="Times New Roman" w:hAnsi="Times New Roman" w:cs="Times New Roman"/>
-          <w:sz w:val="28"/>
-          <w:szCs w:val="28"/>
-          <w:lang w:val="en-US"/>
-        </w:rPr>
-        <w:t xml:space="preserve">psychiatrist, Harley Quinn, for whom his mother </w:t>
-      </w:r>
-      <w:proofErr w:type="gramStart"/>
-      <w:r>
-        <w:rPr>
-          <w:rFonts w:ascii="Times New Roman" w:hAnsi="Times New Roman" w:cs="Times New Roman"/>
-          <w:sz w:val="28"/>
-          <w:szCs w:val="28"/>
-          <w:lang w:val="en-US"/>
-        </w:rPr>
-        <w:t>paid for</w:t>
-      </w:r>
-      <w:proofErr w:type="gramEnd"/>
-      <w:r>
-        <w:rPr>
-          <w:rFonts w:ascii="Times New Roman" w:hAnsi="Times New Roman" w:cs="Times New Roman"/>
-          <w:sz w:val="28"/>
-          <w:szCs w:val="28"/>
-          <w:lang w:val="en-US"/>
-        </w:rPr>
-        <w:t xml:space="preserve"> to get him help.</w:t>
-      </w:r>
-      <w:r>
-        <w:rPr>
-          <w:rFonts w:ascii="Times New Roman" w:hAnsi="Times New Roman" w:cs="Times New Roman"/>
-          <w:sz w:val="28"/>
-          <w:szCs w:val="28"/>
-          <w:lang w:val="en-US"/>
-        </w:rPr>
-        <w:t xml:space="preserve"> Fearing the possibility of losing her, Danny has chosen to fully identify as a skeleton and intends to conceal his </w:t>
-      </w:r>
-      <w:proofErr w:type="gramStart"/>
-      <w:r>
-        <w:rPr>
-          <w:rFonts w:ascii="Times New Roman" w:hAnsi="Times New Roman" w:cs="Times New Roman"/>
-          <w:sz w:val="28"/>
-          <w:szCs w:val="28"/>
-          <w:lang w:val="en-US"/>
-        </w:rPr>
-        <w:t>true identity</w:t>
-      </w:r>
-      <w:proofErr w:type="gramEnd"/>
-      <w:r>
-        <w:rPr>
-          <w:rFonts w:ascii="Times New Roman" w:hAnsi="Times New Roman" w:cs="Times New Roman"/>
-          <w:sz w:val="28"/>
-          <w:szCs w:val="28"/>
-          <w:lang w:val="en-US"/>
-        </w:rPr>
-        <w:t xml:space="preserve"> from </w:t>
-      </w:r>
-      <w:r>
-        <w:rPr>
-          <w:rFonts w:ascii="Times New Roman" w:hAnsi="Times New Roman" w:cs="Times New Roman"/>
+        <w:t>. He had abandoned her and her mother for his psychiatrist, Harley Quinn, for whom his mother paid for to get him help. Fearing the possibility of losing her, Danny has chosen to fully identify as a skeleton and intends to conceal his true identity from her for the rest of his life, petrified that she’ll turn him into soup if sh</w:t>
+      </w:r>
+      <w:r>
+        <w:rPr>
+          <w:rFonts w:ascii="Times New Roman" w:hAnsi="Times New Roman" w:cs="Times New Roman"/>
+          <w:sz w:val="28"/>
+          <w:szCs w:val="28"/>
+          <w:lang w:val="en-US"/>
+        </w:rPr>
+        <w:t xml:space="preserve">e ever finds out. </w:t>
+      </w:r>
+    </w:p>
+    <w:p>
+      <w:pPr>
+        <w:rPr>
+          <w:rFonts w:ascii="Times New Roman" w:hAnsi="Times New Roman" w:cs="Times New Roman"/>
+          <w:sz w:val="28"/>
+          <w:szCs w:val="28"/>
+          <w:lang w:val="en-US"/>
+        </w:rPr>
+      </w:pPr>
+      <w:r>
+        <w:rPr>
+          <w:rFonts w:ascii="Times New Roman" w:hAnsi="Times New Roman" w:cs="Times New Roman"/>
+          <w:noProof/>
           <w:sz w:val="28"/>
           <w:szCs w:val="28"/>
           <w:lang w:val="en-US"/>
         </w:rPr>
         <w:lastRenderedPageBreak/>
-        <w:t>her for the rest of his life, petrified that she’ll turn him into soup if sh</w:t>
-      </w:r>
-      <w:r>
-        <w:rPr>
-          <w:rFonts w:ascii="Times New Roman" w:hAnsi="Times New Roman" w:cs="Times New Roman"/>
-          <w:sz w:val="28"/>
-          <w:szCs w:val="28"/>
-          <w:lang w:val="en-US"/>
-        </w:rPr>
-        <w:t xml:space="preserve">e ever finds out. </w:t>
+        <w:drawing>
+          <wp:inline distT="0" distB="0" distL="0" distR="0" wp14:anchorId="42713E07" wp14:editId="56D6D6D1">
+            <wp:extent cx="2348876" cy="5086350"/>
+            <wp:effectExtent l="0" t="0" r="0" b="0"/>
+            <wp:docPr id="1064725678" name="Picture 4"/>
+            <wp:cNvGraphicFramePr>
+              <a:graphicFrameLocks xmlns:a="http://schemas.openxmlformats.org/drawingml/2006/main" noChangeAspect="1"/>
+            </wp:cNvGraphicFramePr>
+            <a:graphic xmlns:a="http://schemas.openxmlformats.org/drawingml/2006/main">
+              <a:graphicData uri="http://schemas.openxmlformats.org/drawingml/2006/picture">
+                <pic:pic xmlns:pic="http://schemas.openxmlformats.org/drawingml/2006/picture">
+                  <pic:nvPicPr>
+                    <pic:cNvPr id="0" name="Picture 4"/>
+                    <pic:cNvPicPr>
+                      <a:picLocks noChangeAspect="1" noChangeArrowheads="1"/>
+                    </pic:cNvPicPr>
+                  </pic:nvPicPr>
+                  <pic:blipFill>
+                    <a:blip r:embed="rId7">
+                      <a:extLst>
+                        <a:ext uri="{28A0092B-C50C-407E-A947-70E740481C1C}">
+                          <a14:useLocalDpi xmlns:a14="http://schemas.microsoft.com/office/drawing/2010/main" val="0"/>
+                        </a:ext>
+                      </a:extLst>
+                    </a:blip>
+                    <a:srcRect/>
+                    <a:stretch>
+                      <a:fillRect/>
+                    </a:stretch>
+                  </pic:blipFill>
+                  <pic:spPr bwMode="auto">
+                    <a:xfrm>
+                      <a:off x="0" y="0"/>
+                      <a:ext cx="2354063" cy="5097582"/>
+                    </a:xfrm>
+                    <a:prstGeom prst="rect">
+                      <a:avLst/>
+                    </a:prstGeom>
+                    <a:noFill/>
+                    <a:ln>
+                      <a:noFill/>
+                    </a:ln>
+                  </pic:spPr>
+                </pic:pic>
+              </a:graphicData>
+            </a:graphic>
+          </wp:inline>
+        </w:drawing>
       </w:r>
     </w:p>
     <w:p>
@@ -506,38 +707,76 @@
           <w:szCs w:val="28"/>
           <w:lang w:val="en-US"/>
         </w:rPr>
-        <w:t xml:space="preserve"> Danny vows to lay his jokes to rest to ensure harmony and safety in his love life. This unexpected decision stems from his deep fear of losing his witch wife, who remains unaware of his </w:t>
-      </w:r>
-      <w:proofErr w:type="gramStart"/>
-      <w:r>
-        <w:rPr>
-          <w:rFonts w:ascii="Times New Roman" w:hAnsi="Times New Roman" w:cs="Times New Roman"/>
-          <w:sz w:val="28"/>
-          <w:szCs w:val="28"/>
-          <w:lang w:val="en-US"/>
-        </w:rPr>
-        <w:t>true identity</w:t>
-      </w:r>
-      <w:proofErr w:type="gramEnd"/>
-      <w:r>
-        <w:rPr>
-          <w:rFonts w:ascii="Times New Roman" w:hAnsi="Times New Roman" w:cs="Times New Roman"/>
-          <w:sz w:val="28"/>
-          <w:szCs w:val="28"/>
-          <w:lang w:val="en-US"/>
-        </w:rPr>
-        <w:t xml:space="preserve">. </w:t>
-      </w:r>
-    </w:p>
-    <w:p>
-      <w:pPr>
-        <w:rPr>
-          <w:rFonts w:ascii="Times New Roman" w:hAnsi="Times New Roman" w:cs="Times New Roman"/>
-          <w:sz w:val="28"/>
-          <w:szCs w:val="28"/>
-          <w:lang w:val="en-US"/>
-        </w:rPr>
-      </w:pPr>
+        <w:t xml:space="preserve"> Danny vows to lay his jokes to rest to ensure harmony and safety in his love life. This unexpected decision stems from his deep fear of losing his witch wife, who remains unaware of his true identity. </w:t>
+      </w:r>
+    </w:p>
+    <w:p>
+      <w:pPr>
+        <w:rPr>
+          <w:rFonts w:ascii="Times New Roman" w:hAnsi="Times New Roman" w:cs="Times New Roman"/>
+          <w:sz w:val="28"/>
+          <w:szCs w:val="28"/>
+          <w:lang w:val="en-US"/>
+        </w:rPr>
+      </w:pPr>
+      <w:r>
+        <w:rPr>
+          <w:rFonts w:ascii="Times New Roman" w:hAnsi="Times New Roman" w:cs="Times New Roman"/>
+          <w:noProof/>
+          <w:sz w:val="28"/>
+          <w:szCs w:val="28"/>
+          <w:lang w:val="en-US"/>
+        </w:rPr>
+        <w:lastRenderedPageBreak/>
+        <w:drawing>
+          <wp:inline distT="0" distB="0" distL="0" distR="0" wp14:anchorId="4E7AB2BA" wp14:editId="162B0493">
+            <wp:extent cx="2767987" cy="3400425"/>
+            <wp:effectExtent l="0" t="0" r="0" b="0"/>
+            <wp:docPr id="1514769981" name="Picture 5"/>
+            <wp:cNvGraphicFramePr>
+              <a:graphicFrameLocks xmlns:a="http://schemas.openxmlformats.org/drawingml/2006/main" noChangeAspect="1"/>
+            </wp:cNvGraphicFramePr>
+            <a:graphic xmlns:a="http://schemas.openxmlformats.org/drawingml/2006/main">
+              <a:graphicData uri="http://schemas.openxmlformats.org/drawingml/2006/picture">
+                <pic:pic xmlns:pic="http://schemas.openxmlformats.org/drawingml/2006/picture">
+                  <pic:nvPicPr>
+                    <pic:cNvPr id="0" name="Picture 5"/>
+                    <pic:cNvPicPr>
+                      <a:picLocks noChangeAspect="1" noChangeArrowheads="1"/>
+                    </pic:cNvPicPr>
+                  </pic:nvPicPr>
+                  <pic:blipFill>
+                    <a:blip r:embed="rId8" cstate="print">
+                      <a:extLst>
+                        <a:ext uri="{28A0092B-C50C-407E-A947-70E740481C1C}">
+                          <a14:useLocalDpi xmlns:a14="http://schemas.microsoft.com/office/drawing/2010/main" val="0"/>
+                        </a:ext>
+                      </a:extLst>
+                    </a:blip>
+                    <a:srcRect/>
+                    <a:stretch>
+                      <a:fillRect/>
+                    </a:stretch>
+                  </pic:blipFill>
+                  <pic:spPr bwMode="auto">
+                    <a:xfrm>
+                      <a:off x="0" y="0"/>
+                      <a:ext cx="2773057" cy="3406653"/>
+                    </a:xfrm>
+                    <a:prstGeom prst="rect">
+                      <a:avLst/>
+                    </a:prstGeom>
+                    <a:noFill/>
+                    <a:ln>
+                      <a:noFill/>
+                    </a:ln>
+                  </pic:spPr>
+                </pic:pic>
+              </a:graphicData>
+            </a:graphic>
+          </wp:inline>
+        </w:drawing>
+      </w:r>
     </w:p>
     <w:p>
       <w:pPr>
@@ -560,7 +799,7 @@
 </file>
 
 <file path=word/styles.xml><?xml version="1.0" encoding="utf-8"?>
-<w:styles xmlns:mc="http://schemas.openxmlformats.org/markup-compatibility/2006" xmlns:r="http://schemas.openxmlformats.org/officeDocument/2006/relationships" xmlns:w="http://schemas.openxmlformats.org/wordprocessingml/2006/main" xmlns:w14="http://schemas.microsoft.com/office/word/2010/wordml" xmlns:w15="http://schemas.microsoft.com/office/word/2012/wordml" xmlns:w16cex="http://schemas.microsoft.com/office/word/2018/wordml/cex" xmlns:w16cid="http://schemas.microsoft.com/office/word/2016/wordml/cid" xmlns:w16="http://schemas.microsoft.com/office/word/2018/wordml" xmlns:w16sdtdh="http://schemas.microsoft.com/office/word/2020/wordml/sdtdatahash" xmlns:w16se="http://schemas.microsoft.com/office/word/2015/wordml/symex" mc:Ignorable="w14 w15 w16se w16cid w16 w16cex w16sdtdh">
+<w:styles xmlns:mc="http://schemas.openxmlformats.org/markup-compatibility/2006" xmlns:r="http://schemas.openxmlformats.org/officeDocument/2006/relationships" xmlns:w="http://schemas.openxmlformats.org/wordprocessingml/2006/main" xmlns:w14="http://schemas.microsoft.com/office/word/2010/wordml" xmlns:w15="http://schemas.microsoft.com/office/word/2012/wordml" xmlns:w16cex="http://schemas.microsoft.com/office/word/2018/wordml/cex" xmlns:w16cid="http://schemas.microsoft.com/office/word/2016/wordml/cid" xmlns:w16="http://schemas.microsoft.com/office/word/2018/wordml" xmlns:w16du="http://schemas.microsoft.com/office/word/2023/wordml/word16du" xmlns:w16sdtdh="http://schemas.microsoft.com/office/word/2020/wordml/sdtdatahash" xmlns:w16se="http://schemas.microsoft.com/office/word/2015/wordml/symex" mc:Ignorable="w14 w15 w16se w16cid w16 w16cex w16sdtdh w16du">
   <w:docDefaults>
     <w:rPrDefault>
       <w:rPr>

</xml_diff>